<commit_message>
Updated the sources of REQ-036 and REQ-037
</commit_message>
<xml_diff>
--- a/docs/rtm.docx
+++ b/docs/rtm.docx
@@ -8047,9 +8047,65 @@
                 <w:rFonts w:ascii="Times New Roman" w:hAnsi="Times New Roman" w:cs="Times New Roman"/>
                 <w:sz w:val="12"/>
                 <w:szCs w:val="12"/>
-              </w:rPr>
-              <w:t>NFR-012</w:t>
-            </w:r>
+                <w:lang w:val="en-US"/>
+              </w:rPr>
+              <w:t>STK-006 </w:t>
+            </w:r>
+            <w:r>
+              <w:rPr>
+                <w:rFonts w:ascii="Times New Roman" w:hAnsi="Times New Roman" w:cs="Times New Roman"/>
+                <w:sz w:val="12"/>
+                <w:szCs w:val="12"/>
+              </w:rPr>
+              <w:t> </w:t>
+            </w:r>
+          </w:p>
+          <w:p>
+            <w:pPr>
+              <w:rPr>
+                <w:rFonts w:ascii="Times New Roman" w:hAnsi="Times New Roman" w:cs="Times New Roman"/>
+                <w:sz w:val="12"/>
+                <w:szCs w:val="12"/>
+                <w:lang w:val="en-US"/>
+              </w:rPr>
+            </w:pPr>
+            <w:r>
+              <w:rPr>
+                <w:rFonts w:ascii="Times New Roman" w:hAnsi="Times New Roman" w:cs="Times New Roman"/>
+                <w:sz w:val="12"/>
+                <w:szCs w:val="12"/>
+                <w:lang w:val="en-US"/>
+              </w:rPr>
+              <w:t>/  </w:t>
+            </w:r>
+          </w:p>
+          <w:p>
+            <w:pPr>
+              <w:rPr>
+                <w:rFonts w:ascii="Times New Roman" w:hAnsi="Times New Roman" w:cs="Times New Roman"/>
+                <w:sz w:val="12"/>
+                <w:szCs w:val="12"/>
+                <w:lang w:val="en-US"/>
+              </w:rPr>
+            </w:pPr>
+            <w:r>
+              <w:rPr>
+                <w:rFonts w:ascii="Times New Roman" w:hAnsi="Times New Roman" w:cs="Times New Roman"/>
+                <w:sz w:val="12"/>
+                <w:szCs w:val="12"/>
+                <w:lang w:val="en-US"/>
+              </w:rPr>
+              <w:t>NFR-012 </w:t>
+            </w:r>
+          </w:p>
+          <w:p>
+            <w:pPr>
+              <w:rPr>
+                <w:rFonts w:ascii="Times New Roman" w:hAnsi="Times New Roman" w:cs="Times New Roman"/>
+                <w:sz w:val="12"/>
+                <w:szCs w:val="12"/>
+              </w:rPr>
+            </w:pPr>
           </w:p>
         </w:tc>
         <w:tc>
@@ -8221,16 +8277,65 @@
                 <w:rFonts w:ascii="Times New Roman" w:hAnsi="Times New Roman" w:cs="Times New Roman"/>
                 <w:sz w:val="12"/>
                 <w:szCs w:val="12"/>
-              </w:rPr>
-            </w:pPr>
-            <w:r>
-              <w:rPr>
-                <w:rFonts w:ascii="Times New Roman" w:hAnsi="Times New Roman" w:cs="Times New Roman"/>
-                <w:sz w:val="12"/>
-                <w:szCs w:val="12"/>
-              </w:rPr>
-              <w:t>NFR-013</w:t>
-            </w:r>
+                <w:lang w:val="en-US"/>
+              </w:rPr>
+            </w:pPr>
+            <w:r>
+              <w:rPr>
+                <w:rFonts w:ascii="Times New Roman" w:hAnsi="Times New Roman" w:cs="Times New Roman"/>
+                <w:sz w:val="12"/>
+                <w:szCs w:val="12"/>
+                <w:lang w:val="en-US"/>
+              </w:rPr>
+              <w:t>NFR-013 </w:t>
+            </w:r>
+          </w:p>
+          <w:p>
+            <w:pPr>
+              <w:rPr>
+                <w:rFonts w:ascii="Times New Roman" w:hAnsi="Times New Roman" w:cs="Times New Roman"/>
+                <w:sz w:val="12"/>
+                <w:szCs w:val="12"/>
+                <w:lang w:val="en-US"/>
+              </w:rPr>
+            </w:pPr>
+            <w:r>
+              <w:rPr>
+                <w:rFonts w:ascii="Times New Roman" w:hAnsi="Times New Roman" w:cs="Times New Roman"/>
+                <w:sz w:val="12"/>
+                <w:szCs w:val="12"/>
+                <w:lang w:val="en-US"/>
+              </w:rPr>
+              <w:t>/ </w:t>
+            </w:r>
+          </w:p>
+          <w:p>
+            <w:pPr>
+              <w:rPr>
+                <w:rFonts w:ascii="Times New Roman" w:hAnsi="Times New Roman" w:cs="Times New Roman"/>
+                <w:sz w:val="12"/>
+                <w:szCs w:val="12"/>
+                <w:lang w:val="en-US"/>
+              </w:rPr>
+            </w:pPr>
+            <w:r>
+              <w:rPr>
+                <w:rFonts w:ascii="Times New Roman" w:hAnsi="Times New Roman" w:cs="Times New Roman"/>
+                <w:sz w:val="12"/>
+                <w:szCs w:val="12"/>
+                <w:lang w:val="en-US"/>
+              </w:rPr>
+              <w:t>Project Master Brief </w:t>
+            </w:r>
+          </w:p>
+          <w:p>
+            <w:pPr>
+              <w:rPr>
+                <w:rFonts w:ascii="Times New Roman" w:hAnsi="Times New Roman" w:cs="Times New Roman"/>
+                <w:sz w:val="12"/>
+                <w:szCs w:val="12"/>
+              </w:rPr>
+            </w:pPr>
           </w:p>
         </w:tc>
         <w:tc>
@@ -9010,7 +9115,6 @@
   <w:style w:type="character" w:default="1" w:styleId="DefaultParagraphFont">
     <w:name w:val="Default Paragraph Font"/>
     <w:uiPriority w:val="1"/>
-    <w:semiHidden/>
     <w:unhideWhenUsed/>
   </w:style>
   <w:style w:type="table" w:default="1" w:styleId="TableNormal">

</xml_diff>